<commit_message>
JECH submission: Word equation objects, separate figure files, clean build, zip
Co-Authored-By: Tatsuki Onishi <bougtoir@gmail.com>
</commit_message>
<xml_diff>
--- a/documents/JECH/regional_anaesthesia_JECH_EN.docx
+++ b/documents/JECH/regional_anaesthesia_JECH_EN.docx
@@ -69,7 +69,7 @@
           <w:i/>
           <w:sz w:val="24"/>
         </w:rPr>
-        <w:t>Word count (main text, excluding abstract, references, tables and figures): approximately 2900 words</w:t>
+        <w:t>Word count (main text, excluding abstract, references, tables and figures): approximately 2895 words</w:t>
       </w:r>
     </w:p>
     <w:p>
@@ -144,7 +144,7 @@
           <w:rFonts w:ascii="Times New Roman" w:hAnsi="Times New Roman"/>
           <w:sz w:val="24"/>
         </w:rPr>
-        <w:t>Background  Geographic variation in anaesthesia practice is well documented, but it remains unclear whether it reflects real differences in care or artefacts of coding, reimbursement and auditing. Japan's uniform national fee schedule combined with prefecture-specific claims auditing offers a natural experiment for separating these explanations.</w:t>
+        <w:t>Background Geographic variation in anaesthesia practice is well documented, but it remains unclear whether it reflects real differences in care or artefacts of coding, reimbursement and auditing. Japan's uniform national fee schedule combined with prefecture-specific claims auditing offers a natural experiment for separating these explanations.</w:t>
       </w:r>
     </w:p>
     <w:p>
@@ -153,7 +153,7 @@
           <w:rFonts w:ascii="Times New Roman" w:hAnsi="Times New Roman"/>
           <w:sz w:val="24"/>
         </w:rPr>
-        <w:t>Methods  We conducted a cross-sectional ecological study using age- and sex-standardised claim ratios for general, spinal, epidural and continuous epidural anaesthesia across 335 secondary medical areas nested within 47 prefectures, fiscal year 2022. We fitted multilevel linear models with prefecture random intercepts and a university-hospital fixed effect, and performed sensitivity analyses for population density, anaesthesiologist supply and plausible differential audit rates.</w:t>
+        <w:t>Methods We conducted a cross-sectional ecological study using age- and sex-standardised claim ratios for general, spinal, epidural and continuous epidural anaesthesia across 335 secondary medical areas nested within 47 prefectures, fiscal year 2022. We fitted multilevel linear models with prefecture random intercepts and a university-hospital fixed effect, and performed sensitivity analyses for population density, anaesthesiologist supply and plausible differential audit rates.</w:t>
       </w:r>
     </w:p>
     <w:p>
@@ -162,7 +162,52 @@
           <w:rFonts w:ascii="Times New Roman" w:hAnsi="Times New Roman"/>
           <w:sz w:val="24"/>
         </w:rPr>
-        <w:t>Results  Coefficients of variation ranged from 53.7% (general anaesthesia) to 87.2% (epidural). For general anaesthesia, only 0.058 of variance lay between prefectures; university hospital presence explained 0.358 of total variance (β = 64.1, 95% CI 54.8 to 73.4, P &lt;0.001) and was positive in every prefecture. Maximum plausible audit-related ratio shifts were small relative to the observed interquartile range (general anaesthesia: 0.53%). Covariate adjustment attenuated but did not eliminate the university-hospital effect for general, epidural and continuous epidural anaesthesia.</w:t>
+        <w:t>Results Coefficients of variation ranged from 53.7% (general anaesthesia) to 87.2% (epidural). For general anaesthesia, only 0.058 of variance lay between prefectures; university hospital presence explained 0.358 of total variance (</w:t>
+      </w:r>
+      <m:oMath>
+        <m:r>
+          <m:t xml:space="preserve">β </m:t>
+        </m:r>
+        <m:r>
+          <m:t xml:space="preserve">= </m:t>
+        </m:r>
+        <m:r>
+          <m:t xml:space="preserve">64.1</m:t>
+        </m:r>
+        <m:r>
+          <m:t xml:space="preserve">, </m:t>
+        </m:r>
+        <m:r>
+          <m:t xml:space="preserve">95% CI </m:t>
+        </m:r>
+        <m:r>
+          <m:t xml:space="preserve">54.8 </m:t>
+        </m:r>
+        <m:r>
+          <m:t xml:space="preserve">to </m:t>
+        </m:r>
+        <m:r>
+          <m:t xml:space="preserve">73.4</m:t>
+        </m:r>
+        <m:r>
+          <m:t xml:space="preserve">, </m:t>
+        </m:r>
+        <m:r>
+          <m:t xml:space="preserve">P </m:t>
+        </m:r>
+        <m:r>
+          <m:t xml:space="preserve">&lt;</m:t>
+        </m:r>
+        <m:r>
+          <m:t xml:space="preserve">0.001</m:t>
+        </m:r>
+      </m:oMath>
+      <w:r>
+        <w:rPr>
+          <w:rFonts w:ascii="Times New Roman" w:hAnsi="Times New Roman"/>
+          <w:sz w:val="24"/>
+        </w:rPr>
+        <w:t>) and was positive in every prefecture. Maximum plausible audit-related ratio shifts were small relative to the observed interquartile range (general anaesthesia: 0.53%). Covariate adjustment attenuated but did not eliminate the university-hospital effect for general, epidural and continuous epidural anaesthesia.</w:t>
       </w:r>
     </w:p>
     <w:p>
@@ -171,7 +216,7 @@
           <w:rFonts w:ascii="Times New Roman" w:hAnsi="Times New Roman"/>
           <w:sz w:val="24"/>
         </w:rPr>
-        <w:t>Conclusion  Regional variation in anaesthesia practice is predominantly structural, driven by access to university hospitals rather than by prefectural auditing. In Japan and similar universal-coverage systems, this pattern signals inequitable access to neuraxial techniques and should be addressed through workforce and organisational policy, not additional coding audits.</w:t>
+        <w:t>Conclusion Regional variation in anaesthesia practice is predominantly structural, driven by access to university hospitals rather than by prefectural auditing. In Japan and similar universal-coverage systems, this pattern signals inequitable access to neuraxial techniques and should be addressed through workforce and organisational policy, not additional coding audits.</w:t>
       </w:r>
     </w:p>
     <w:p>
@@ -219,6 +264,7 @@
       <w:r>
         <w:rPr>
           <w:rFonts w:ascii="Times New Roman" w:hAnsi="Times New Roman"/>
+          <w:b/>
           <w:sz w:val="24"/>
         </w:rPr>
         <w:t>What is already known on this topic</w:t>
@@ -237,6 +283,7 @@
       <w:r>
         <w:rPr>
           <w:rFonts w:ascii="Times New Roman" w:hAnsi="Times New Roman"/>
+          <w:b/>
           <w:sz w:val="24"/>
         </w:rPr>
         <w:t>What this study adds</w:t>
@@ -255,6 +302,7 @@
       <w:r>
         <w:rPr>
           <w:rFonts w:ascii="Times New Roman" w:hAnsi="Times New Roman"/>
+          <w:b/>
           <w:sz w:val="24"/>
         </w:rPr>
         <w:t>How this study might affect research, practice or policy</w:t>
@@ -338,7 +386,7 @@
           <w:rFonts w:ascii="Times New Roman" w:hAnsi="Times New Roman"/>
           <w:sz w:val="24"/>
         </w:rPr>
-        <w:t xml:space="preserve"> Where audits differ, between-area variation in claims could reflect differential scrutiny rather than differential care. Separating these explanations is important for population health research and policy: if variation is real, it signals inequitable access; if it is an artefact, quality-improvement and payment reforms may be misdirected.</w:t>
+        <w:t xml:space="preserve"> Where audits differ, between-area variation in claims could reflect differential scrutiny rather than differential care. Distinguishing between them is important for population health research and policy: if variation is real, it signals inequitable access; if it is an artefact, quality-improvement and payment reforms may be misdirected.</w:t>
       </w:r>
     </w:p>
     <w:p>
@@ -1771,58 +1819,6 @@
     </w:p>
     <w:p>
       <w:pPr>
-        <w:spacing w:before="240" w:after="120"/>
-      </w:pPr>
-      <w:r>
-        <w:rPr>
-          <w:rFonts w:ascii="Times New Roman" w:hAnsi="Times New Roman"/>
-          <w:b/>
-          <w:sz w:val="24"/>
-        </w:rPr>
-        <w:t>Figure 1.</w:t>
-      </w:r>
-    </w:p>
-    <w:p>
-      <w:pPr>
-        <w:jc w:val="center"/>
-      </w:pPr>
-      <w:r>
-        <w:drawing>
-          <wp:inline xmlns:a="http://schemas.openxmlformats.org/drawingml/2006/main" xmlns:pic="http://schemas.openxmlformats.org/drawingml/2006/picture">
-            <wp:extent cx="5760720" cy="6795010"/>
-            <wp:docPr id="1" name="Picture 1"/>
-            <wp:cNvGraphicFramePr>
-              <a:graphicFrameLocks noChangeAspect="1"/>
-            </wp:cNvGraphicFramePr>
-            <a:graphic>
-              <a:graphicData uri="http://schemas.openxmlformats.org/drawingml/2006/picture">
-                <pic:pic>
-                  <pic:nvPicPr>
-                    <pic:cNvPr id="0" name="rapm_fig1_en.png"/>
-                    <pic:cNvPicPr/>
-                  </pic:nvPicPr>
-                  <pic:blipFill>
-                    <a:blip r:embed="rId9"/>
-                    <a:stretch>
-                      <a:fillRect/>
-                    </a:stretch>
-                  </pic:blipFill>
-                  <pic:spPr>
-                    <a:xfrm>
-                      <a:off x="0" y="0"/>
-                      <a:ext cx="5760720" cy="6795010"/>
-                    </a:xfrm>
-                    <a:prstGeom prst="rect"/>
-                  </pic:spPr>
-                </pic:pic>
-              </a:graphicData>
-            </a:graphic>
-          </wp:inline>
-        </w:drawing>
-      </w:r>
-    </w:p>
-    <w:p>
-      <w:pPr>
         <w:spacing w:after="0"/>
       </w:pPr>
     </w:p>
@@ -1845,7 +1841,133 @@
           <w:rFonts w:ascii="Times New Roman" w:hAnsi="Times New Roman"/>
           <w:sz w:val="24"/>
         </w:rPr>
-        <w:t>The null multilevel model showed that only 0.058 of general anaesthesia variance was attributable to the prefecture level (intraclass correlation coefficient 0.058), indicating that 85.5% occurred within prefectures where audit policy is uniform. Spinal anaesthesia showed stronger prefecture-level clustering (intraclass correlation coefficient 0.343), consistent with a greater role of prefectural factors for that code. Adding university hospital presence as a fixed effect produced the largest improvement for general anaesthesia (marginal R² 0.358; β = 64.1, 95% confidence interval 54.8 to 73.4) and was statistically significant for every code (all P &lt;0.001) (Table 3). University hospital areas had higher general anaesthesia ratios than non-university areas in 47 of 47 prefectures, with a mean within-prefecture difference of +63.3 points (paired t = 13.28, P &lt;0.001) (Figure 2A). Cohen's d for the university hospital effect on general anaesthesia was 1.88; on continuous epidural infusion 1.12; on epidural anaesthesia 0.59; and on spinal anaesthesia 0.40. A combined measure capturing the general-anaesthesia plus continuous-epidural workflow (mean of L008 and L003 SCR; 331 areas with data for both codes) showed a coefficient of variation of 55.5% and preserved a large university hospital effect (Cohen's d 1.55; university mean 130.3 versus non-university 70.2) (Figure 2B).</w:t>
+        <w:t>The null multilevel model showed that only 0.058 of general anaesthesia variance was attributable to the prefecture level (intraclass correlation coefficient 0.058), indicating that 85.5% occurred within prefectures where audit policy is uniform. Spinal anaesthesia showed stronger prefecture-level clustering (intraclass correlation coefficient 0.343), consistent with a greater role of prefectural factors for that code. Adding university hospital presence as a fixed effect produced the largest improvement for general anaesthesia (</w:t>
+      </w:r>
+      <m:oMath>
+        <m:r>
+          <m:t xml:space="preserve">marginal </m:t>
+        </m:r>
+        <m:sSup>
+          <m:e>
+            <m:r>
+              <m:t xml:space="preserve">R</m:t>
+            </m:r>
+          </m:e>
+          <m:sup>
+            <m:r>
+              <m:t xml:space="preserve">2</m:t>
+            </m:r>
+          </m:sup>
+        </m:sSup>
+        <m:r>
+          <m:t xml:space="preserve"> </m:t>
+        </m:r>
+        <m:r>
+          <m:t xml:space="preserve">0.358</m:t>
+        </m:r>
+      </m:oMath>
+      <w:r>
+        <w:rPr>
+          <w:rFonts w:ascii="Times New Roman" w:hAnsi="Times New Roman"/>
+          <w:sz w:val="24"/>
+        </w:rPr>
+        <w:t xml:space="preserve">; </w:t>
+      </w:r>
+      <m:oMath>
+        <m:r>
+          <m:t xml:space="preserve">β </m:t>
+        </m:r>
+        <m:r>
+          <m:t xml:space="preserve">= </m:t>
+        </m:r>
+        <m:r>
+          <m:t xml:space="preserve">64.1</m:t>
+        </m:r>
+        <m:r>
+          <m:t xml:space="preserve">, </m:t>
+        </m:r>
+        <m:r>
+          <m:t xml:space="preserve">95% confidence interval </m:t>
+        </m:r>
+        <m:r>
+          <m:t xml:space="preserve">54.8 </m:t>
+        </m:r>
+        <m:r>
+          <m:t xml:space="preserve">to </m:t>
+        </m:r>
+        <m:r>
+          <m:t xml:space="preserve">73.4</m:t>
+        </m:r>
+      </m:oMath>
+      <w:r>
+        <w:rPr>
+          <w:rFonts w:ascii="Times New Roman" w:hAnsi="Times New Roman"/>
+          <w:sz w:val="24"/>
+        </w:rPr>
+        <w:t xml:space="preserve">) and was statistically significant for every code (all </w:t>
+      </w:r>
+      <m:oMath>
+        <m:r>
+          <m:t xml:space="preserve">P </m:t>
+        </m:r>
+        <m:r>
+          <m:t xml:space="preserve">&lt;</m:t>
+        </m:r>
+        <m:r>
+          <m:t xml:space="preserve">0.001</m:t>
+        </m:r>
+      </m:oMath>
+      <w:r>
+        <w:rPr>
+          <w:rFonts w:ascii="Times New Roman" w:hAnsi="Times New Roman"/>
+          <w:sz w:val="24"/>
+        </w:rPr>
+        <w:t xml:space="preserve">) (Table 3). University hospital areas had higher general anaesthesia ratios than non-university areas in 47 of 47 prefectures, with a mean within-prefecture difference of +63.3 points (paired </w:t>
+      </w:r>
+      <m:oMath>
+        <m:r>
+          <m:t xml:space="preserve">t </m:t>
+        </m:r>
+        <m:r>
+          <m:t xml:space="preserve">= </m:t>
+        </m:r>
+        <m:r>
+          <m:t xml:space="preserve">13.28</m:t>
+        </m:r>
+        <m:r>
+          <m:t xml:space="preserve">, </m:t>
+        </m:r>
+        <m:r>
+          <m:t xml:space="preserve">P </m:t>
+        </m:r>
+        <m:r>
+          <m:t xml:space="preserve">&lt;</m:t>
+        </m:r>
+        <m:r>
+          <m:t xml:space="preserve">0.001</m:t>
+        </m:r>
+      </m:oMath>
+      <w:r>
+        <w:rPr>
+          <w:rFonts w:ascii="Times New Roman" w:hAnsi="Times New Roman"/>
+          <w:sz w:val="24"/>
+        </w:rPr>
+        <w:t>) (Figure 2A). Cohen's d for the university hospital effect on general anaesthesia was 1.88; on continuous epidural infusion 1.12; on epidural anaesthesia 0.59; and on spinal anaesthesia 0.40. A combined measure capturing the general-anaesthesia plus continuous-epidural workflow (mean of L008 and L003 SCR; 331 areas with data for both codes) showed a coefficient of variation of 55.5% and preserved a large university hospital effect (</w:t>
+      </w:r>
+      <m:oMath>
+        <m:r>
+          <m:t xml:space="preserve">Cohen's d </m:t>
+        </m:r>
+        <m:r>
+          <m:t xml:space="preserve">1.55</m:t>
+        </m:r>
+      </m:oMath>
+      <w:r>
+        <w:rPr>
+          <w:rFonts w:ascii="Times New Roman" w:hAnsi="Times New Roman"/>
+          <w:sz w:val="24"/>
+        </w:rPr>
+        <w:t>; university mean 130.3 versus non-university 70.2) (Figure 2B).</w:t>
       </w:r>
     </w:p>
     <w:p>
@@ -1919,7 +2041,19 @@
                 <w:b/>
                 <w:sz w:val="20"/>
               </w:rPr>
-              <w:t>β university (95% CI)</w:t>
+            </w:r>
+            <m:oMath>
+              <m:r>
+                <m:t xml:space="preserve">β</m:t>
+              </m:r>
+            </m:oMath>
+            <w:r>
+              <w:rPr>
+                <w:rFonts w:ascii="Times New Roman" w:hAnsi="Times New Roman"/>
+                <w:b/>
+                <w:sz w:val="20"/>
+              </w:rPr>
+              <w:t xml:space="preserve"> university (95% CI)</w:t>
             </w:r>
           </w:p>
         </w:tc>
@@ -1951,7 +2085,28 @@
                 <w:b/>
                 <w:sz w:val="20"/>
               </w:rPr>
-              <w:t>Marginal R²</w:t>
+              <w:t xml:space="preserve">Marginal </w:t>
+            </w:r>
+            <m:oMath>
+              <m:sSup>
+                <m:e>
+                  <m:r>
+                    <m:t xml:space="preserve">R</m:t>
+                  </m:r>
+                </m:e>
+                <m:sup>
+                  <m:r>
+                    <m:t xml:space="preserve">2</m:t>
+                  </m:r>
+                </m:sup>
+              </m:sSup>
+            </m:oMath>
+            <w:r>
+              <w:rPr>
+                <w:rFonts w:ascii="Times New Roman" w:hAnsi="Times New Roman"/>
+                <w:b/>
+                <w:sz w:val="20"/>
+              </w:rPr>
             </w:r>
           </w:p>
         </w:tc>
@@ -2275,7 +2430,41 @@
           <w:i/>
           <w:sz w:val="24"/>
         </w:rPr>
-        <w:t>β university, fixed effect coefficient for university hospital presence (binary 0/1); CI, confidence interval; ICC, intraclass correlation coefficient (proportion of variance attributable to prefecture level in the null random-intercept model); Marginal R², proportional reduction in total (prefecture + residual) variance from the null model after adding the university hospital fixed effect. Models were estimated by restricted maximum likelihood.</w:t>
+      </w:r>
+      <m:oMath>
+        <m:r>
+          <m:t xml:space="preserve">β</m:t>
+        </m:r>
+      </m:oMath>
+      <w:r>
+        <w:rPr>
+          <w:rFonts w:ascii="Times New Roman" w:hAnsi="Times New Roman"/>
+          <w:i/>
+          <w:sz w:val="24"/>
+        </w:rPr>
+        <w:t xml:space="preserve"> university, fixed effect coefficient for university hospital presence (binary 0/1); CI, confidence interval; ICC, intraclass correlation coefficient (proportion of variance attributable to prefecture level in the null random-intercept model); Marginal </w:t>
+      </w:r>
+      <m:oMath>
+        <m:sSup>
+          <m:e>
+            <m:r>
+              <m:t xml:space="preserve">R</m:t>
+            </m:r>
+          </m:e>
+          <m:sup>
+            <m:r>
+              <m:t xml:space="preserve">2</m:t>
+            </m:r>
+          </m:sup>
+        </m:sSup>
+      </m:oMath>
+      <w:r>
+        <w:rPr>
+          <w:rFonts w:ascii="Times New Roman" w:hAnsi="Times New Roman"/>
+          <w:i/>
+          <w:sz w:val="24"/>
+        </w:rPr>
+        <w:t>, proportional reduction in total (prefecture + residual) variance from the null model after adding the university hospital fixed effect. Models were estimated by restricted maximum likelihood.</w:t>
       </w:r>
     </w:p>
     <w:p>
@@ -2284,7 +2473,229 @@
           <w:rFonts w:ascii="Times New Roman" w:hAnsi="Times New Roman"/>
           <w:sz w:val="24"/>
         </w:rPr>
-        <w:t>A covariate-adjusted sensitivity model added the natural logarithm of population density and the anaesthesiologist share of all physicians (both standardised). The university hospital coefficient was attenuated but remained positive and statistically significant for general anaesthesia (β = +41.8, 95% CI 32.4 to 51.2, P &lt;0.001), epidural anaesthesia (β = +39.1, 95% CI 14.5 to 63.7, P 0.002) and continuous epidural infusion (β = +33.9, 95% CI 20.0 to 47.7, P &lt;0.001). For spinal anaesthesia the point estimate was positive but no longer statistically significant (β = +9.7, 95% CI -4.0 to 23.3, P 0.165). Population density was positively associated with general anaesthesia ratios (β = 8.3, P &lt;0.001) but not with the other three codes. The anaesthesiologist share was positively associated with general, epidural, continuous epidural and spinal anaesthesia (P &lt;0.001, 0.039, &lt;0.001 and 0.005, respectively). The covariate-adjusted mixed models produced optimizer-convergence warnings in Statsmodels;</w:t>
+        <w:t>A covariate-adjusted sensitivity model added the natural logarithm of population density and the anaesthesiologist share of all physicians (both standardised). The university hospital coefficient was attenuated but remained positive and statistically significant for general anaesthesia (</w:t>
+      </w:r>
+      <m:oMath>
+        <m:r>
+          <m:t xml:space="preserve">β </m:t>
+        </m:r>
+        <m:r>
+          <m:t xml:space="preserve">= </m:t>
+        </m:r>
+        <m:r>
+          <m:t xml:space="preserve">+41.8</m:t>
+        </m:r>
+        <m:r>
+          <m:t xml:space="preserve">, </m:t>
+        </m:r>
+        <m:r>
+          <m:t xml:space="preserve">95% CI </m:t>
+        </m:r>
+        <m:r>
+          <m:t xml:space="preserve">32.4 </m:t>
+        </m:r>
+        <m:r>
+          <m:t xml:space="preserve">to </m:t>
+        </m:r>
+        <m:r>
+          <m:t xml:space="preserve">51.2</m:t>
+        </m:r>
+        <m:r>
+          <m:t xml:space="preserve">, </m:t>
+        </m:r>
+        <m:r>
+          <m:t xml:space="preserve">P </m:t>
+        </m:r>
+        <m:r>
+          <m:t xml:space="preserve">&lt;</m:t>
+        </m:r>
+        <m:r>
+          <m:t xml:space="preserve">0.001</m:t>
+        </m:r>
+      </m:oMath>
+      <w:r>
+        <w:rPr>
+          <w:rFonts w:ascii="Times New Roman" w:hAnsi="Times New Roman"/>
+          <w:sz w:val="24"/>
+        </w:rPr>
+        <w:t>), epidural anaesthesia (</w:t>
+      </w:r>
+      <m:oMath>
+        <m:r>
+          <m:t xml:space="preserve">β </m:t>
+        </m:r>
+        <m:r>
+          <m:t xml:space="preserve">= </m:t>
+        </m:r>
+        <m:r>
+          <m:t xml:space="preserve">+39.1</m:t>
+        </m:r>
+        <m:r>
+          <m:t xml:space="preserve">, </m:t>
+        </m:r>
+        <m:r>
+          <m:t xml:space="preserve">95% CI </m:t>
+        </m:r>
+        <m:r>
+          <m:t xml:space="preserve">14.5 </m:t>
+        </m:r>
+        <m:r>
+          <m:t xml:space="preserve">to </m:t>
+        </m:r>
+        <m:r>
+          <m:t xml:space="preserve">63.7</m:t>
+        </m:r>
+        <m:r>
+          <m:t xml:space="preserve">, </m:t>
+        </m:r>
+        <m:r>
+          <m:t xml:space="preserve">P </m:t>
+        </m:r>
+        <m:r>
+          <m:t xml:space="preserve">0.002</m:t>
+        </m:r>
+      </m:oMath>
+      <w:r>
+        <w:rPr>
+          <w:rFonts w:ascii="Times New Roman" w:hAnsi="Times New Roman"/>
+          <w:sz w:val="24"/>
+        </w:rPr>
+        <w:t>) and continuous epidural infusion (</w:t>
+      </w:r>
+      <m:oMath>
+        <m:r>
+          <m:t xml:space="preserve">β </m:t>
+        </m:r>
+        <m:r>
+          <m:t xml:space="preserve">= </m:t>
+        </m:r>
+        <m:r>
+          <m:t xml:space="preserve">+33.9</m:t>
+        </m:r>
+        <m:r>
+          <m:t xml:space="preserve">, </m:t>
+        </m:r>
+        <m:r>
+          <m:t xml:space="preserve">95% CI </m:t>
+        </m:r>
+        <m:r>
+          <m:t xml:space="preserve">20.0 </m:t>
+        </m:r>
+        <m:r>
+          <m:t xml:space="preserve">to </m:t>
+        </m:r>
+        <m:r>
+          <m:t xml:space="preserve">47.7</m:t>
+        </m:r>
+        <m:r>
+          <m:t xml:space="preserve">, </m:t>
+        </m:r>
+        <m:r>
+          <m:t xml:space="preserve">P </m:t>
+        </m:r>
+        <m:r>
+          <m:t xml:space="preserve">&lt;</m:t>
+        </m:r>
+        <m:r>
+          <m:t xml:space="preserve">0.001</m:t>
+        </m:r>
+      </m:oMath>
+      <w:r>
+        <w:rPr>
+          <w:rFonts w:ascii="Times New Roman" w:hAnsi="Times New Roman"/>
+          <w:sz w:val="24"/>
+        </w:rPr>
+        <w:t>). For spinal anaesthesia the point estimate was positive but no longer statistically significant (</w:t>
+      </w:r>
+      <m:oMath>
+        <m:r>
+          <m:t xml:space="preserve">β </m:t>
+        </m:r>
+        <m:r>
+          <m:t xml:space="preserve">= </m:t>
+        </m:r>
+        <m:r>
+          <m:t xml:space="preserve">+9.7</m:t>
+        </m:r>
+        <m:r>
+          <m:t xml:space="preserve">, </m:t>
+        </m:r>
+        <m:r>
+          <m:t xml:space="preserve">95% CI </m:t>
+        </m:r>
+        <m:r>
+          <m:t xml:space="preserve">-4.0 </m:t>
+        </m:r>
+        <m:r>
+          <m:t xml:space="preserve">to </m:t>
+        </m:r>
+        <m:r>
+          <m:t xml:space="preserve">23.3</m:t>
+        </m:r>
+        <m:r>
+          <m:t xml:space="preserve">, </m:t>
+        </m:r>
+        <m:r>
+          <m:t xml:space="preserve">P </m:t>
+        </m:r>
+        <m:r>
+          <m:t xml:space="preserve">0.165</m:t>
+        </m:r>
+      </m:oMath>
+      <w:r>
+        <w:rPr>
+          <w:rFonts w:ascii="Times New Roman" w:hAnsi="Times New Roman"/>
+          <w:sz w:val="24"/>
+        </w:rPr>
+        <w:t>). Population density was positively associated with general anaesthesia ratios (</w:t>
+      </w:r>
+      <m:oMath>
+        <m:r>
+          <m:t xml:space="preserve">β </m:t>
+        </m:r>
+        <m:r>
+          <m:t xml:space="preserve">= </m:t>
+        </m:r>
+        <m:r>
+          <m:t xml:space="preserve">8.3</m:t>
+        </m:r>
+        <m:r>
+          <m:t xml:space="preserve">, </m:t>
+        </m:r>
+        <m:r>
+          <m:t xml:space="preserve">P </m:t>
+        </m:r>
+        <m:r>
+          <m:t xml:space="preserve">&lt;</m:t>
+        </m:r>
+        <m:r>
+          <m:t xml:space="preserve">0.001</m:t>
+        </m:r>
+      </m:oMath>
+      <w:r>
+        <w:rPr>
+          <w:rFonts w:ascii="Times New Roman" w:hAnsi="Times New Roman"/>
+          <w:sz w:val="24"/>
+        </w:rPr>
+        <w:t>) but not with the other three codes. The anaesthesiologist share was positively associated with general, epidural, continuous epidural and spinal anaesthesia (</w:t>
+      </w:r>
+      <m:oMath>
+        <m:r>
+          <m:t xml:space="preserve">P </m:t>
+        </m:r>
+        <m:r>
+          <m:t xml:space="preserve">&lt;</m:t>
+        </m:r>
+        <m:r>
+          <m:t xml:space="preserve">0.001</m:t>
+        </m:r>
+      </m:oMath>
+      <w:r>
+        <w:rPr>
+          <w:rFonts w:ascii="Times New Roman" w:hAnsi="Times New Roman"/>
+          <w:sz w:val="24"/>
+        </w:rPr>
+        <w:t>, 0.039, &lt;0.001 and 0.005, respectively). The covariate-adjusted mixed models produced optimizer-convergence warnings in Statsmodels;</w:t>
       </w:r>
       <w:r>
         <w:rPr>
@@ -2300,58 +2711,6 @@
           <w:sz w:val="24"/>
         </w:rPr>
         <w:t xml:space="preserve"> we therefore refitted them with the lbfgs and cg optimisers, and the point estimates remained stable across optimisers and sensitivity analyses.</w:t>
-      </w:r>
-    </w:p>
-    <w:p>
-      <w:pPr>
-        <w:spacing w:before="240" w:after="120"/>
-      </w:pPr>
-      <w:r>
-        <w:rPr>
-          <w:rFonts w:ascii="Times New Roman" w:hAnsi="Times New Roman"/>
-          <w:b/>
-          <w:sz w:val="24"/>
-        </w:rPr>
-        <w:t>Figure 2.</w:t>
-      </w:r>
-    </w:p>
-    <w:p>
-      <w:pPr>
-        <w:jc w:val="center"/>
-      </w:pPr>
-      <w:r>
-        <w:drawing>
-          <wp:inline xmlns:a="http://schemas.openxmlformats.org/drawingml/2006/main" xmlns:pic="http://schemas.openxmlformats.org/drawingml/2006/picture">
-            <wp:extent cx="5760720" cy="3384910"/>
-            <wp:docPr id="2" name="Picture 2"/>
-            <wp:cNvGraphicFramePr>
-              <a:graphicFrameLocks noChangeAspect="1"/>
-            </wp:cNvGraphicFramePr>
-            <a:graphic>
-              <a:graphicData uri="http://schemas.openxmlformats.org/drawingml/2006/picture">
-                <pic:pic>
-                  <pic:nvPicPr>
-                    <pic:cNvPr id="0" name="rapm_fig2_en.png"/>
-                    <pic:cNvPicPr/>
-                  </pic:nvPicPr>
-                  <pic:blipFill>
-                    <a:blip r:embed="rId10"/>
-                    <a:stretch>
-                      <a:fillRect/>
-                    </a:stretch>
-                  </pic:blipFill>
-                  <pic:spPr>
-                    <a:xfrm>
-                      <a:off x="0" y="0"/>
-                      <a:ext cx="5760720" cy="3384910"/>
-                    </a:xfrm>
-                    <a:prstGeom prst="rect"/>
-                  </pic:spPr>
-                </pic:pic>
-              </a:graphicData>
-            </a:graphic>
-          </wp:inline>
-        </w:drawing>
       </w:r>
     </w:p>
     <w:p>
@@ -2378,7 +2737,82 @@
           <w:rFonts w:ascii="Times New Roman" w:hAnsi="Times New Roman"/>
           <w:sz w:val="24"/>
         </w:rPr>
-        <w:t>All three pre-specified sensitivity analyses converged in rejecting the audit hypothesis. First, within-prefecture variance decomposition attributed 14.5% of general anaesthesia variance to between-prefecture differences, 40.5% to the university hospital effect within prefecture, and 45.0% to residual within-group variation; the university hospital effect alone explained 47.4% of all within-prefecture variance. Second, general and spinal anaesthesia were positively, not negatively, correlated (r = 0.235, P &lt;0.001), as were general and epidural anaesthesia (r = 0.319, P &lt;0.001), inconsistent with audit-driven reclassification and consistent with a common supply factor. Third, the maximum prefectural audit-rate difference of 0.28 percentage points could produce a ratio shift of approximately 0.28 points, equivalent to approximately 0.53% of the observed interquartile range for general anaesthesia and 0.27% for epidural anaesthesia. Combining general (L008) and spinal (L004) ratios produced an alternative audit-insensitive measure with a coefficient of variation of 43.4% and a university hospital effect that remained large (Cohen's d 1.26), confirming that the structural effect is not artefactually erased by combining reclassifiable codes.</w:t>
+        <w:t>All three pre-specified sensitivity analyses converged in rejecting the audit hypothesis. First, within-prefecture variance decomposition attributed 14.5% of general anaesthesia variance to between-prefecture differences, 40.5% to the university hospital effect within prefecture, and 45.0% to residual within-group variation; the university hospital effect alone explained 47.4% of all within-prefecture variance. Second, general and spinal anaesthesia were positively, not negatively, correlated (</w:t>
+      </w:r>
+      <m:oMath>
+        <m:r>
+          <m:t xml:space="preserve">r </m:t>
+        </m:r>
+        <m:r>
+          <m:t xml:space="preserve">= </m:t>
+        </m:r>
+        <m:r>
+          <m:t xml:space="preserve">0.235</m:t>
+        </m:r>
+        <m:r>
+          <m:t xml:space="preserve">, </m:t>
+        </m:r>
+        <m:r>
+          <m:t xml:space="preserve">P </m:t>
+        </m:r>
+        <m:r>
+          <m:t xml:space="preserve">&lt;</m:t>
+        </m:r>
+        <m:r>
+          <m:t xml:space="preserve">0.001</m:t>
+        </m:r>
+      </m:oMath>
+      <w:r>
+        <w:rPr>
+          <w:rFonts w:ascii="Times New Roman" w:hAnsi="Times New Roman"/>
+          <w:sz w:val="24"/>
+        </w:rPr>
+        <w:t>), as were general and epidural anaesthesia (</w:t>
+      </w:r>
+      <m:oMath>
+        <m:r>
+          <m:t xml:space="preserve">r </m:t>
+        </m:r>
+        <m:r>
+          <m:t xml:space="preserve">= </m:t>
+        </m:r>
+        <m:r>
+          <m:t xml:space="preserve">0.319</m:t>
+        </m:r>
+        <m:r>
+          <m:t xml:space="preserve">, </m:t>
+        </m:r>
+        <m:r>
+          <m:t xml:space="preserve">P </m:t>
+        </m:r>
+        <m:r>
+          <m:t xml:space="preserve">&lt;</m:t>
+        </m:r>
+        <m:r>
+          <m:t xml:space="preserve">0.001</m:t>
+        </m:r>
+      </m:oMath>
+      <w:r>
+        <w:rPr>
+          <w:rFonts w:ascii="Times New Roman" w:hAnsi="Times New Roman"/>
+          <w:sz w:val="24"/>
+        </w:rPr>
+        <w:t>), inconsistent with audit-driven reclassification and consistent with a common supply factor. Third, the maximum prefectural audit-rate difference of 0.28 percentage points could produce a ratio shift of approximately 0.28 points, equivalent to approximately 0.53% of the observed interquartile range for general anaesthesia and 0.27% for epidural anaesthesia. Combining general (L008) and spinal (L004) ratios produced an alternative audit-insensitive measure with a coefficient of variation of 43.4% and a university hospital effect that remained large (</w:t>
+      </w:r>
+      <m:oMath>
+        <m:r>
+          <m:t xml:space="preserve">Cohen's d </m:t>
+        </m:r>
+        <m:r>
+          <m:t xml:space="preserve">1.26</m:t>
+        </m:r>
+      </m:oMath>
+      <w:r>
+        <w:rPr>
+          <w:rFonts w:ascii="Times New Roman" w:hAnsi="Times New Roman"/>
+          <w:sz w:val="24"/>
+        </w:rPr>
+        <w:t>), confirming that the structural effect is not artefactually erased by combining reclassifiable codes.</w:t>
       </w:r>
     </w:p>
     <w:p>
@@ -2554,7 +2988,25 @@
           <w:rFonts w:ascii="Times New Roman" w:hAnsi="Times New Roman"/>
           <w:sz w:val="24"/>
         </w:rPr>
-        <w:t xml:space="preserve"> Our study extends this evidence by exploiting Japan's uniform fee schedule combined with prefecture-specific auditing to disentangle administrative and structural sources of variation, and by providing, to our knowledge, the first multilevel small-area analysis of anaesthesia technique under universal coverage in East Asia. The university hospital effect we report (Cohen's d = 1.88) is substantial, plausibly reflecting the influence of the ikyoku (university medical office) system on practice in affiliated hospitals.</w:t>
+        <w:t xml:space="preserve"> Our study extends this evidence by exploiting Japan's uniform fee schedule combined with prefecture-specific auditing to disentangle administrative and structural sources of variation, and by providing, to our knowledge, the first multilevel small-area analysis of anaesthesia technique under universal coverage in East Asia. The university hospital effect we report (</w:t>
+      </w:r>
+      <m:oMath>
+        <m:r>
+          <m:t xml:space="preserve">Cohen's d </m:t>
+        </m:r>
+        <m:r>
+          <m:t xml:space="preserve">= </m:t>
+        </m:r>
+        <m:r>
+          <m:t xml:space="preserve">1.88</m:t>
+        </m:r>
+      </m:oMath>
+      <w:r>
+        <w:rPr>
+          <w:rFonts w:ascii="Times New Roman" w:hAnsi="Times New Roman"/>
+          <w:sz w:val="24"/>
+        </w:rPr>
+        <w:t>) is substantial, plausibly reflecting the influence of the ikyoku (university medical office) system on practice in affiliated hospitals.</w:t>
       </w:r>
       <w:r>
         <w:rPr>
@@ -2631,7 +3083,7 @@
           <w:rFonts w:ascii="Times New Roman" w:hAnsi="Times New Roman"/>
           <w:sz w:val="24"/>
         </w:rPr>
-        <w:t xml:space="preserve"> In contrast to the highly localised, physician-style-driven variation often reported in the US, the Japanese pattern is more strongly organisational, concentrated around university hospitals, and consistent across all 47 prefectures. This suggests that the structural-access explanation is a robust feature of high-income universal-coverage systems rather than a Japanese idiosyncrasy. Extrapolation to low- and middle-income countries is more cautious because fee schedules and audit arrangements are typically heterogeneous and claims data often incomplete.</w:t>
+        <w:t xml:space="preserve"> In contrast to the highly localised, physician-style-driven variation often reported in the US, the Japanese pattern is more strongly organisational, concentrated around university hospitals, and consistent across all 47 prefectures. This suggests that the structural-access explanation is a robust feature of high-income universal-coverage systems rather than a Japanese idiosyncrasy. Extrapolation to low- and middle-income countries should be more cautious, because fee schedules and audit arrangements are typically heterogeneous and claims data often incomplete.</w:t>
       </w:r>
     </w:p>
     <w:p>
@@ -2653,7 +3105,7 @@
           <w:rFonts w:ascii="Times New Roman" w:hAnsi="Times New Roman"/>
           <w:sz w:val="24"/>
         </w:rPr>
-        <w:t>From a population-health perspective, our findings have three implications. First, administrative claims data can be used as a surveillance tool to monitor small-area variation in perioperative care under universal coverage, but should be interpreted alongside sensitivity analyses for coding and audit effects. Second, the observed variation in epidural and continuous epidural use signals a potential equity gap: patients' access to techniques that may improve recovery should not depend on whether they live near a university hospital. Third, regulators should focus on workforce and organisational determinants of anaesthesia service delivery rather than treating low regional ratios primarily as coding or fraud problems. The variance-decomposition framework we used is transferable to other procedures and to other countries with a national fee schedule and regional audit variation, offering a practical epidemiologic approach to separating administrative from structural sources of small-area variation.</w:t>
+        <w:t>Three public-health implications follow from these findings. First, administrative claims data can be used as a surveillance tool to monitor small-area variation in perioperative care under universal coverage, but should be interpreted alongside sensitivity analyses for coding and audit effects. Second, the observed variation in epidural and continuous epidural use signals a potential equity gap: patients' access to techniques that may improve recovery should not depend on whether they live near a university hospital. Third, regulators should focus on workforce and organisational determinants of anaesthesia service delivery rather than treating low regional ratios primarily as coding or fraud problems. The variance-decomposition framework we used is transferable to other procedures and to other countries with a national fee schedule and regional audit variation, offering a practical epidemiologic approach to separating administrative from structural sources of small-area variation.</w:t>
       </w:r>
     </w:p>
     <w:p>

</xml_diff>

<commit_message>
JCA: fix word count (exclude table captions/notes and keywords) and make STROBE page extraction fall back when LibreOffice/pdftotext are missing; rebuild JCA/JECH packages
Co-Authored-By: Tatsuki Onishi <bougtoir@gmail.com>
</commit_message>
<xml_diff>
--- a/documents/JECH/regional_anaesthesia_JECH_EN.docx
+++ b/documents/JECH/regional_anaesthesia_JECH_EN.docx
@@ -79,7 +79,7 @@
           <w:i/>
           <w:sz w:val="24"/>
         </w:rPr>
-        <w:t>Tables: 3   Figures: 2   References: 21</w:t>
+        <w:t>Tables: 3   Figures: 2   References: 22</w:t>
       </w:r>
     </w:p>
     <w:p>
@@ -403,7 +403,7 @@
           <w:sz w:val="24"/>
           <w:vertAlign w:val="superscript"/>
         </w:rPr>
-        <w:t>4-5</w:t>
+        <w:t>4-6</w:t>
       </w:r>
       <w:r>
         <w:rPr>
@@ -418,7 +418,7 @@
           <w:sz w:val="24"/>
           <w:vertAlign w:val="superscript"/>
         </w:rPr>
-        <w:t>6</w:t>
+        <w:t>7</w:t>
       </w:r>
     </w:p>
     <w:p>
@@ -470,7 +470,7 @@
           <w:sz w:val="24"/>
           <w:vertAlign w:val="superscript"/>
         </w:rPr>
-        <w:t>7</w:t>
+        <w:t>8</w:t>
       </w:r>
       <w:r>
         <w:rPr>
@@ -507,7 +507,7 @@
           <w:sz w:val="24"/>
           <w:vertAlign w:val="superscript"/>
         </w:rPr>
-        <w:t>8</w:t>
+        <w:t>9</w:t>
       </w:r>
       <w:r>
         <w:rPr>
@@ -522,7 +522,7 @@
           <w:sz w:val="24"/>
           <w:vertAlign w:val="superscript"/>
         </w:rPr>
-        <w:t>9</w:t>
+        <w:t>10</w:t>
       </w:r>
       <w:r>
         <w:rPr>
@@ -559,7 +559,7 @@
           <w:sz w:val="24"/>
           <w:vertAlign w:val="superscript"/>
         </w:rPr>
-        <w:t>10</w:t>
+        <w:t>11</w:t>
       </w:r>
       <w:r>
         <w:rPr>
@@ -574,7 +574,7 @@
           <w:sz w:val="24"/>
           <w:vertAlign w:val="superscript"/>
         </w:rPr>
-        <w:t>11</w:t>
+        <w:t>12</w:t>
       </w:r>
       <w:r>
         <w:rPr>
@@ -589,7 +589,7 @@
           <w:sz w:val="24"/>
           <w:vertAlign w:val="superscript"/>
         </w:rPr>
-        <w:t>12</w:t>
+        <w:t>13</w:t>
       </w:r>
     </w:p>
     <w:p>
@@ -2703,7 +2703,7 @@
           <w:sz w:val="24"/>
           <w:vertAlign w:val="superscript"/>
         </w:rPr>
-        <w:t>13</w:t>
+        <w:t>14</w:t>
       </w:r>
       <w:r>
         <w:rPr>
@@ -2899,7 +2899,7 @@
           <w:sz w:val="24"/>
           <w:vertAlign w:val="superscript"/>
         </w:rPr>
-        <w:t>14</w:t>
+        <w:t>15</w:t>
       </w:r>
       <w:r>
         <w:rPr>
@@ -2936,7 +2936,7 @@
           <w:sz w:val="24"/>
           <w:vertAlign w:val="superscript"/>
         </w:rPr>
-        <w:t>15</w:t>
+        <w:t>16</w:t>
       </w:r>
       <w:r>
         <w:rPr>
@@ -2951,7 +2951,7 @@
           <w:sz w:val="24"/>
           <w:vertAlign w:val="superscript"/>
         </w:rPr>
-        <w:t>16</w:t>
+        <w:t>17</w:t>
       </w:r>
       <w:r>
         <w:rPr>
@@ -2966,7 +2966,7 @@
           <w:sz w:val="24"/>
           <w:vertAlign w:val="superscript"/>
         </w:rPr>
-        <w:t>17</w:t>
+        <w:t>18</w:t>
       </w:r>
       <w:r>
         <w:rPr>
@@ -2981,7 +2981,7 @@
           <w:sz w:val="24"/>
           <w:vertAlign w:val="superscript"/>
         </w:rPr>
-        <w:t>18</w:t>
+        <w:t>19</w:t>
       </w:r>
       <w:r>
         <w:rPr>
@@ -3014,7 +3014,7 @@
           <w:sz w:val="24"/>
           <w:vertAlign w:val="superscript"/>
         </w:rPr>
-        <w:t>19</w:t>
+        <w:t>20</w:t>
       </w:r>
     </w:p>
     <w:p>
@@ -3031,7 +3031,7 @@
           <w:sz w:val="24"/>
           <w:vertAlign w:val="superscript"/>
         </w:rPr>
-        <w:t>20</w:t>
+        <w:t>21</w:t>
       </w:r>
       <w:r>
         <w:rPr>
@@ -3046,7 +3046,7 @@
           <w:sz w:val="24"/>
           <w:vertAlign w:val="superscript"/>
         </w:rPr>
-        <w:t>16,17</w:t>
+        <w:t>17,18</w:t>
       </w:r>
       <w:r>
         <w:rPr>
@@ -3061,7 +3061,7 @@
           <w:sz w:val="24"/>
           <w:vertAlign w:val="superscript"/>
         </w:rPr>
-        <w:t>15,16</w:t>
+        <w:t>16,17</w:t>
       </w:r>
       <w:r>
         <w:rPr>
@@ -3076,7 +3076,7 @@
           <w:sz w:val="24"/>
           <w:vertAlign w:val="superscript"/>
         </w:rPr>
-        <w:t>21</w:t>
+        <w:t>22</w:t>
       </w:r>
       <w:r>
         <w:rPr>
@@ -3235,7 +3235,7 @@
           <w:rFonts w:ascii="Times New Roman" w:hAnsi="Times New Roman"/>
           <w:sz w:val="24"/>
         </w:rPr>
-        <w:t>Weng M, Chen W, Hou W, et al. The effect of neuraxial anaesthesia on cancer recurrence and survival after cancer surgery: an updated meta-analysis. Oncotarget 2016;7:15262-73.</w:t>
+        <w:t>Chen WK, Miao CH. The effect of anesthetic technique on survival in human cancers: a meta-analysis of retrospective and prospective studies. PLoS One 2013;8:e56540.</w:t>
       </w:r>
     </w:p>
     <w:p>
@@ -3254,7 +3254,7 @@
           <w:rFonts w:ascii="Times New Roman" w:hAnsi="Times New Roman"/>
           <w:sz w:val="24"/>
         </w:rPr>
-        <w:t>Ministry of Health, Labour and Welfare. 2026 revision of the medical fee schedule: changes to the medical fee schedule master (R08). Tokyo: MHLW, 2026. https://shinryohoshu.mhlw.go.jp/shinryohoshu/file/info/smente260522.pdf (accessed 24 Jul 2026).</w:t>
+        <w:t>Weng M, Chen W, Hou W, et al. The effect of neuraxial anaesthesia on cancer recurrence and survival after cancer surgery: an updated meta-analysis. Oncotarget 2016;7:15262-73.</w:t>
       </w:r>
     </w:p>
     <w:p>
@@ -3273,7 +3273,7 @@
           <w:rFonts w:ascii="Times New Roman" w:hAnsi="Times New Roman"/>
           <w:sz w:val="24"/>
         </w:rPr>
-        <w:t>von Elm E, Altman DG, Egger M, et al. The Strengthening the Reporting of Observational Studies in Epidemiology (STROBE) statement: guidelines for reporting observational studies. Lancet 2007;370:1453-7.</w:t>
+        <w:t>Ministry of Health, Labour and Welfare. 2026 revision of the medical fee schedule: changes to the medical fee schedule master (R08). Tokyo: MHLW, 2026. https://shinryohoshu.mhlw.go.jp/shinryohoshu/file/info/smente260522.pdf (accessed 24 Jul 2026).</w:t>
       </w:r>
     </w:p>
     <w:p>
@@ -3292,7 +3292,7 @@
           <w:rFonts w:ascii="Times New Roman" w:hAnsi="Times New Roman"/>
           <w:sz w:val="24"/>
         </w:rPr>
-        <w:t>Matsuda S. Health policy in Japan: current situation and future challenges. JMA J 2019;2:1-10.</w:t>
+        <w:t>von Elm E, Altman DG, Egger M, et al. The Strengthening the Reporting of Observational Studies in Epidemiology (STROBE) statement: guidelines for reporting observational studies. Lancet 2007;370:1453-7.</w:t>
       </w:r>
     </w:p>
     <w:p>
@@ -3311,7 +3311,7 @@
           <w:rFonts w:ascii="Times New Roman" w:hAnsi="Times New Roman"/>
           <w:sz w:val="24"/>
         </w:rPr>
-        <w:t>Wennberg JE, Cooper MM, eds. The Dartmouth Atlas of Health Care. Chicago: American Hospital Publishing, 1999.</w:t>
+        <w:t>Matsuda S. Health policy in Japan: current situation and future challenges. JMA J 2019;2:1-10.</w:t>
       </w:r>
     </w:p>
     <w:p>
@@ -3330,7 +3330,7 @@
           <w:rFonts w:ascii="Times New Roman" w:hAnsi="Times New Roman"/>
           <w:sz w:val="24"/>
         </w:rPr>
-        <w:t>Cabinet Office. Regional variation visualisation (chiikisa no mieruka). https://www5.cao.go.jp/keizai-shimon/kaigi/special/reform/mieruka/chiikisa/index.html (accessed 10 Mar 2026).</w:t>
+        <w:t>Wennberg JE, Cooper MM, eds. The Dartmouth Atlas of Health Care. Chicago: American Hospital Publishing, 1999.</w:t>
       </w:r>
     </w:p>
     <w:p>
@@ -3349,7 +3349,7 @@
           <w:rFonts w:ascii="Times New Roman" w:hAnsi="Times New Roman"/>
           <w:sz w:val="24"/>
         </w:rPr>
-        <w:t>Ministry of Health, Labour and Welfare. Survey of Physicians, Dentists and Pharmacists 2022 (e-Stat). https://www.e-stat.go.jp (accessed 12 Mar 2026).</w:t>
+        <w:t>Cabinet Office. Regional variation visualisation (chiikisa no mieruka). https://www5.cao.go.jp/keizai-shimon/kaigi/special/reform/mieruka/chiikisa/index.html (accessed 10 Mar 2026).</w:t>
       </w:r>
     </w:p>
     <w:p>
@@ -3368,7 +3368,7 @@
           <w:rFonts w:ascii="Times New Roman" w:hAnsi="Times New Roman"/>
           <w:sz w:val="24"/>
         </w:rPr>
-        <w:t>Ministry of Land, Infrastructure, Transport and Tourism. National Land Numerical Information download service. https://nlftp.mlit.go.jp (accessed 10 Mar 2026).</w:t>
+        <w:t>Ministry of Health, Labour and Welfare. Survey of Physicians, Dentists and Pharmacists 2022 (e-Stat). https://www.e-stat.go.jp (accessed 12 Mar 2026).</w:t>
       </w:r>
     </w:p>
     <w:p>
@@ -3387,7 +3387,7 @@
           <w:rFonts w:ascii="Times New Roman" w:hAnsi="Times New Roman"/>
           <w:sz w:val="24"/>
         </w:rPr>
-        <w:t>Seabold S, Perktold J. Statsmodels: econometric and statistical modeling with Python. In: Proceedings of the 9th Python in Science Conference. 2010:92-6.</w:t>
+        <w:t>Ministry of Land, Infrastructure, Transport and Tourism. National Land Numerical Information download service. https://nlftp.mlit.go.jp (accessed 10 Mar 2026).</w:t>
       </w:r>
     </w:p>
     <w:p>
@@ -3406,7 +3406,7 @@
           <w:rFonts w:ascii="Times New Roman" w:hAnsi="Times New Roman"/>
           <w:sz w:val="24"/>
         </w:rPr>
-        <w:t>Greenland S. Ecologic versus individual-level sources of bias in ecologic estimates of contextual health effects. Int J Epidemiol 2001;30:1343-50.</w:t>
+        <w:t>Seabold S, Perktold J. Statsmodels: econometric and statistical modeling with Python. In: Proceedings of the 9th Python in Science Conference. 2010:92-6.</w:t>
       </w:r>
     </w:p>
     <w:p>
@@ -3425,7 +3425,7 @@
           <w:rFonts w:ascii="Times New Roman" w:hAnsi="Times New Roman"/>
           <w:sz w:val="24"/>
         </w:rPr>
-        <w:t>Wennberg JE, Fisher ES, Skinner JS. Geography and the debate over Medicare reform. Health Aff (Millwood) 2002;Suppl Web Exclusives:W96-114.</w:t>
+        <w:t>Greenland S. Ecologic versus individual-level sources of bias in ecologic estimates of contextual health effects. Int J Epidemiol 2001;30:1343-50.</w:t>
       </w:r>
     </w:p>
     <w:p>
@@ -3444,7 +3444,7 @@
           <w:rFonts w:ascii="Times New Roman" w:hAnsi="Times New Roman"/>
           <w:sz w:val="24"/>
         </w:rPr>
-        <w:t>NHS RightCare. The NHS Atlas of Variation in Healthcare. London: Public Health England, 2015.</w:t>
+        <w:t>Wennberg JE, Fisher ES, Skinner JS. Geography and the debate over Medicare reform. Health Aff (Millwood) 2002;Suppl Web Exclusives:W96-114.</w:t>
       </w:r>
     </w:p>
     <w:p>
@@ -3463,7 +3463,7 @@
           <w:rFonts w:ascii="Times New Roman" w:hAnsi="Times New Roman"/>
           <w:sz w:val="24"/>
         </w:rPr>
-        <w:t>Schäfer T, Pritzkuleit R, Jeszenszky C, et al. Trends and geographical variation of primary hip and knee joint replacement in Germany. Osteoarthritis Cartilage 2013;21:279-88.</w:t>
+        <w:t>NHS RightCare. The NHS Atlas of Variation in Healthcare. London: Public Health England, 2015.</w:t>
       </w:r>
     </w:p>
     <w:p>
@@ -3482,7 +3482,7 @@
           <w:rFonts w:ascii="Times New Roman" w:hAnsi="Times New Roman"/>
           <w:sz w:val="24"/>
         </w:rPr>
-        <w:t>Australian Commission on Safety and Quality in Health Care. Australian Atlas of Healthcare Variation. Sydney: ACSQHC, 2015.</w:t>
+        <w:t>Schäfer T, Pritzkuleit R, Jeszenszky C, et al. Trends and geographical variation of primary hip and knee joint replacement in Germany. Osteoarthritis Cartilage 2013;21:279-88.</w:t>
       </w:r>
     </w:p>
     <w:p>
@@ -3501,7 +3501,7 @@
           <w:rFonts w:ascii="Times New Roman" w:hAnsi="Times New Roman"/>
           <w:sz w:val="24"/>
         </w:rPr>
-        <w:t>Otsuka T. The ikyoku system of university orthopaedic surgery departments: an in-hospital organisational system unique to Japan. J Orthop Sci 2012;17:513-14.</w:t>
+        <w:t>Australian Commission on Safety and Quality in Health Care. Australian Atlas of Healthcare Variation. Sydney: ACSQHC, 2015.</w:t>
       </w:r>
     </w:p>
     <w:p>
@@ -3520,6 +3520,25 @@
           <w:rFonts w:ascii="Times New Roman" w:hAnsi="Times New Roman"/>
           <w:sz w:val="24"/>
         </w:rPr>
+        <w:t>Otsuka T. The ikyoku system of university orthopaedic surgery departments: an in-hospital organisational system unique to Japan. J Orthop Sci 2012;17:513-14.</w:t>
+      </w:r>
+    </w:p>
+    <w:p>
+      <w:pPr>
+        <w:spacing w:after="0" w:line="480" w:lineRule="auto"/>
+      </w:pPr>
+      <w:r>
+        <w:rPr>
+          <w:rFonts w:ascii="Times New Roman" w:hAnsi="Times New Roman"/>
+          <w:sz w:val="24"/>
+        </w:rPr>
+        <w:t xml:space="preserve">21. </w:t>
+      </w:r>
+      <w:r>
+        <w:rPr>
+          <w:rFonts w:ascii="Times New Roman" w:hAnsi="Times New Roman"/>
+          <w:sz w:val="24"/>
+        </w:rPr>
         <w:t>Cheng T-M. Taiwan's new national health insurance program: genesis and experience so far. Health Aff (Millwood) 2003;22:61-76.</w:t>
       </w:r>
     </w:p>
@@ -3532,7 +3551,7 @@
           <w:rFonts w:ascii="Times New Roman" w:hAnsi="Times New Roman"/>
           <w:sz w:val="24"/>
         </w:rPr>
-        <w:t xml:space="preserve">21. </w:t>
+        <w:t xml:space="preserve">22. </w:t>
       </w:r>
       <w:r>
         <w:rPr>

</xml_diff>